<commit_message>
Docs: going to / want to as the Level 4 audio rule (#42), 2-3 characters plus an optional narrator (#44), Level 3 status and drafts notes (#47)
</commit_message>
<xml_diff>
--- a/level3/curriculum/Level3_Scope_and_Sequence.docx
+++ b/level3/curriculum/Level3_Scope_and_Sequence.docx
@@ -14,7 +14,7 @@
           <w:color w:val="1F3A5F"/>
           <w:sz w:val="52"/>
         </w:rPr>
-        <w:t>Level 3 Adult ESL Curriculum: Scope and Sequence (Draft for Review)</w:t>
+        <w:t>Level 3 Adult ESL Curriculum: Scope and Sequence</w:t>
       </w:r>
     </w:p>
     <w:p>
@@ -35,7 +35,7 @@
           <w:i w:val="0"/>
           <w:sz w:val="22"/>
         </w:rPr>
-        <w:t xml:space="preserve"> Plan only. No lessons, pictures, audio, or slides have been built yet. Nothing has been published.</w:t>
+        <w:t xml:space="preserve"> Published. All 13 Level 3 lessons, pictures, listening audio, and slide decks are on the site. This plan was written first (October 19, 2026); the lessons follow it.</w:t>
       </w:r>
     </w:p>
     <w:p>
@@ -77,7 +77,7 @@
           <w:i w:val="0"/>
           <w:sz w:val="22"/>
         </w:rPr>
-        <w:t xml:space="preserve"> Program coordinators and the curriculum author (for review before the full build)</w:t>
+        <w:t xml:space="preserve"> Program coordinators, teachers, and curriculum authors</w:t>
       </w:r>
     </w:p>
     <w:p>
@@ -29750,7 +29750,7 @@
         <w:color w:val="555555"/>
         <w:sz w:val="17"/>
       </w:rPr>
-      <w:t xml:space="preserve">Level 3 ESL · Scope and Sequence · Draft for review   |   page </w:t>
+      <w:t xml:space="preserve">Level 3 ESL · Scope and Sequence   |   page </w:t>
     </w:r>
     <w:r>
       <w:rPr>

</xml_diff>